<commit_message>
Initialized Book class and it's inheritors
</commit_message>
<xml_diff>
--- a/Library-Loan-System-Specification.docx
+++ b/Library-Loan-System-Specification.docx
@@ -168,72 +168,43 @@
         <w:pStyle w:val="BEKEZDS"/>
       </w:pPr>
       <w:r>
-        <w:t xml:space="preserve">A szoftver fejlesztése Windows 10 vagy 11 rendszerben kell történjen, és a szoftver stabil futását ezekben az operációs rendszerekben garantálni kell. A szoftverfejlesztés a </w:t>
-      </w:r>
-      <w:proofErr w:type="spellStart"/>
-      <w:r>
-        <w:t>JetBrains</w:t>
-      </w:r>
-      <w:proofErr w:type="spellEnd"/>
+        <w:t>A szoftver fejlesztése Windows 10 vagy 11 rendszerben kell történjen, és a szoftver stabil futását ezekben az operációs rendszerekben garantálni kell. A szoftverfejlesztés a JetBrains</w:t>
+      </w:r>
+      <w:r>
+        <w:t xml:space="preserve"> IDEs,</w:t>
+      </w:r>
+      <w:r>
+        <w:t xml:space="preserve"> IntelliJ IDEA Community Edition integrált fejlesztési környezetében kell megtörténjen</w:t>
+      </w:r>
+      <w:r>
+        <w:t>, ezen belül is a 2025.1 vagy annál frissebb verziójú környezetben</w:t>
+      </w:r>
+      <w:r>
+        <w:t>.</w:t>
+      </w:r>
+    </w:p>
+    <w:p>
+      <w:pPr>
+        <w:pStyle w:val="BEKEZDS"/>
+      </w:pPr>
+      <w:r>
+        <w:t>A programot Java nyelven kell implementálni,</w:t>
+      </w:r>
+      <w:r>
+        <w:t xml:space="preserve"> a fe</w:t>
+      </w:r>
+      <w:r>
+        <w:t>jl</w:t>
+      </w:r>
+      <w:r>
+        <w:t>esztés</w:t>
+      </w:r>
+      <w:r>
+        <w:t>hez</w:t>
+      </w:r>
       <w:r>
         <w:t xml:space="preserve"> </w:t>
       </w:r>
-      <w:proofErr w:type="spellStart"/>
-      <w:r>
-        <w:t>IDEs</w:t>
-      </w:r>
-      <w:proofErr w:type="spellEnd"/>
-      <w:r>
-        <w:t>,</w:t>
-      </w:r>
-      <w:r>
-        <w:t xml:space="preserve"> </w:t>
-      </w:r>
-      <w:proofErr w:type="spellStart"/>
-      <w:r>
-        <w:t>IntelliJ</w:t>
-      </w:r>
-      <w:proofErr w:type="spellEnd"/>
-      <w:r>
-        <w:t xml:space="preserve"> IDEA </w:t>
-      </w:r>
-      <w:proofErr w:type="spellStart"/>
-      <w:r>
-        <w:t>Community</w:t>
-      </w:r>
-      <w:proofErr w:type="spellEnd"/>
-      <w:r>
-        <w:t xml:space="preserve"> Edition integrált fejlesztési környezetében kell megtörténjen</w:t>
-      </w:r>
-      <w:r>
-        <w:t>, ezen belül is a 2025.1 vagy annál frissebb verziójú környezetben</w:t>
-      </w:r>
-      <w:r>
-        <w:t>.</w:t>
-      </w:r>
-    </w:p>
-    <w:p>
-      <w:pPr>
-        <w:pStyle w:val="BEKEZDS"/>
-      </w:pPr>
-      <w:r>
-        <w:t>A programot Java nyelven kell implementálni,</w:t>
-      </w:r>
-      <w:r>
-        <w:t xml:space="preserve"> a fe</w:t>
-      </w:r>
-      <w:r>
-        <w:t>jl</w:t>
-      </w:r>
-      <w:r>
-        <w:t>esztés</w:t>
-      </w:r>
-      <w:r>
-        <w:t>hez</w:t>
-      </w:r>
-      <w:r>
-        <w:t xml:space="preserve"> </w:t>
-      </w:r>
       <w:r>
         <w:t xml:space="preserve">kizárólag </w:t>
       </w:r>
@@ -247,29 +218,16 @@
         <w:t xml:space="preserve"> frissebb verziójú </w:t>
       </w:r>
       <w:r>
-        <w:t xml:space="preserve">Java </w:t>
-      </w:r>
-      <w:proofErr w:type="spellStart"/>
-      <w:r>
-        <w:t>D</w:t>
-      </w:r>
-      <w:r>
-        <w:t>eveloper</w:t>
-      </w:r>
-      <w:proofErr w:type="spellEnd"/>
-      <w:r>
-        <w:t xml:space="preserve"> </w:t>
-      </w:r>
-      <w:proofErr w:type="spellStart"/>
+        <w:t>Java D</w:t>
+      </w:r>
+      <w:r>
+        <w:t xml:space="preserve">eveloper </w:t>
+      </w:r>
       <w:r>
         <w:t>K</w:t>
       </w:r>
       <w:r>
-        <w:t>itet</w:t>
-      </w:r>
-      <w:proofErr w:type="spellEnd"/>
-      <w:r>
-        <w:t xml:space="preserve"> </w:t>
+        <w:t xml:space="preserve">itet </w:t>
       </w:r>
       <w:r>
         <w:t>lehet</w:t>
@@ -424,13 +382,8 @@
       <w:pPr>
         <w:pStyle w:val="ALSBBCM"/>
       </w:pPr>
-      <w:proofErr w:type="spellStart"/>
-      <w:r>
-        <w:t>Bűntetések</w:t>
-      </w:r>
-      <w:proofErr w:type="spellEnd"/>
-      <w:r>
-        <w:t xml:space="preserve"> listázása</w:t>
+      <w:r>
+        <w:t>Bűntetések listázása</w:t>
       </w:r>
     </w:p>
     <w:p>
@@ -438,15 +391,7 @@
         <w:pStyle w:val="ALBEKEZDS"/>
       </w:pPr>
       <w:r>
-        <w:t xml:space="preserve">--Összes érvényben lévő </w:t>
-      </w:r>
-      <w:proofErr w:type="spellStart"/>
-      <w:r>
-        <w:t>bűntetés</w:t>
-      </w:r>
-      <w:proofErr w:type="spellEnd"/>
-      <w:r>
-        <w:t xml:space="preserve"> a könyvtár összes tagja között</w:t>
+        <w:t>--Összes érvényben lévő bűntetés a könyvtár összes tagja között</w:t>
       </w:r>
     </w:p>
     <w:p>
@@ -499,23 +444,13 @@
         <w:t>A könyveket objektumokként kell kezelnie a programnak (Book.java)</w:t>
       </w:r>
       <w:r>
-        <w:t xml:space="preserve">, mely egy absztrakt osztályként van definiálva. Minden kategóriának saját osztálya van, mely a </w:t>
-      </w:r>
-      <w:proofErr w:type="spellStart"/>
-      <w:r>
-        <w:t>Book</w:t>
-      </w:r>
-      <w:proofErr w:type="spellEnd"/>
-      <w:r>
-        <w:t xml:space="preserve"> osztályt </w:t>
-      </w:r>
-      <w:proofErr w:type="spellStart"/>
-      <w:r>
-        <w:t>megörökli</w:t>
-      </w:r>
-      <w:proofErr w:type="spellEnd"/>
-      <w:r>
-        <w:t xml:space="preserve"> és implementálja.</w:t>
+        <w:t xml:space="preserve">, mely egy </w:t>
+      </w:r>
+      <w:r>
+        <w:t xml:space="preserve">interfész </w:t>
+      </w:r>
+      <w:r>
+        <w:t>osztályként van definiálva. Minden kategóriának saját osztálya van, mely a Book osztályt megörökli és implementálja.</w:t>
       </w:r>
     </w:p>
     <w:p>
@@ -814,13 +749,8 @@
       <w:pPr>
         <w:pStyle w:val="BEKEZDS"/>
       </w:pPr>
-      <w:proofErr w:type="spellStart"/>
-      <w:r>
-        <w:t>Book</w:t>
-      </w:r>
-      <w:proofErr w:type="spellEnd"/>
-      <w:r>
-        <w:t xml:space="preserve"> osztályt öröklő osztályok:</w:t>
+      <w:r>
+        <w:t>Book osztályt öröklő osztályok:</w:t>
       </w:r>
     </w:p>
     <w:p>
@@ -834,7 +764,13 @@
         <w:ind w:left="714" w:hanging="357"/>
       </w:pPr>
       <w:r>
-        <w:t>Scifi.java</w:t>
+        <w:t>Sci</w:t>
+      </w:r>
+      <w:r>
+        <w:t>F</w:t>
+      </w:r>
+      <w:r>
+        <w:t>i.java</w:t>
       </w:r>
     </w:p>
     <w:p>
@@ -907,76 +843,23 @@
       <w:r>
         <w:t xml:space="preserve"> tartozik egy egyedi azonosító (</w:t>
       </w:r>
-      <w:proofErr w:type="spellStart"/>
-      <w:r>
-        <w:t>String</w:t>
-      </w:r>
-      <w:proofErr w:type="spellEnd"/>
-      <w:r>
-        <w:t xml:space="preserve"> </w:t>
-      </w:r>
-      <w:proofErr w:type="spellStart"/>
-      <w:r>
-        <w:t>id</w:t>
-      </w:r>
-      <w:proofErr w:type="spellEnd"/>
-      <w:r>
-        <w:t xml:space="preserve">, </w:t>
+      <w:r>
+        <w:t xml:space="preserve">String id, </w:t>
       </w:r>
       <w:r>
         <w:t xml:space="preserve">pl. "SF-001"), cím </w:t>
       </w:r>
       <w:r>
-        <w:t>(</w:t>
-      </w:r>
-      <w:proofErr w:type="spellStart"/>
-      <w:r>
-        <w:t>String</w:t>
-      </w:r>
-      <w:proofErr w:type="spellEnd"/>
-      <w:r>
-        <w:t xml:space="preserve"> </w:t>
-      </w:r>
-      <w:proofErr w:type="spellStart"/>
-      <w:r>
-        <w:t>title</w:t>
-      </w:r>
-      <w:proofErr w:type="spellEnd"/>
-      <w:r>
-        <w:t>),</w:t>
+        <w:t>(String title),</w:t>
       </w:r>
       <w:r>
         <w:t xml:space="preserve"> szerző</w:t>
       </w:r>
       <w:r>
-        <w:t xml:space="preserve"> (</w:t>
-      </w:r>
-      <w:proofErr w:type="spellStart"/>
-      <w:r>
-        <w:t>String</w:t>
-      </w:r>
-      <w:proofErr w:type="spellEnd"/>
-      <w:r>
-        <w:t xml:space="preserve"> </w:t>
-      </w:r>
-      <w:proofErr w:type="spellStart"/>
-      <w:r>
-        <w:t>author</w:t>
-      </w:r>
-      <w:proofErr w:type="spellEnd"/>
-      <w:r>
-        <w:t xml:space="preserve">), egy </w:t>
-      </w:r>
-      <w:r>
-        <w:t xml:space="preserve">kölcsönzési idő (int </w:t>
-      </w:r>
-      <w:proofErr w:type="spellStart"/>
-      <w:r>
-        <w:t>loanDuration</w:t>
-      </w:r>
-      <w:proofErr w:type="spellEnd"/>
-      <w:r>
-        <w:t xml:space="preserve">, </w:t>
+        <w:t xml:space="preserve"> (String author), egy </w:t>
+      </w:r>
+      <w:r>
+        <w:t xml:space="preserve">kölcsönzési idő (int loanDuration, </w:t>
       </w:r>
       <w:r>
         <w:rPr>
@@ -988,15 +871,7 @@
         <w:t>)</w:t>
       </w:r>
       <w:r>
-        <w:t xml:space="preserve"> és egy statikus számláló változó (int </w:t>
-      </w:r>
-      <w:proofErr w:type="spellStart"/>
-      <w:r>
-        <w:t>count</w:t>
-      </w:r>
-      <w:proofErr w:type="spellEnd"/>
-      <w:r>
-        <w:t>), mely az adott kategóriájú könyv példányszámát tartja nyilván, ezt a konstruktorban inkrementálni kell</w:t>
+        <w:t xml:space="preserve"> és egy statikus számláló változó (int count), mely az adott kategóriájú könyv példányszámát tartja nyilván, ezt a konstruktorban inkrementálni kell</w:t>
       </w:r>
     </w:p>
     <w:p>
@@ -1009,45 +884,19 @@
         <w:pStyle w:val="BEKEZDS"/>
       </w:pPr>
       <w:r>
-        <w:t xml:space="preserve">A </w:t>
-      </w:r>
-      <w:proofErr w:type="spellStart"/>
-      <w:r>
-        <w:t>Book</w:t>
-      </w:r>
-      <w:proofErr w:type="spellEnd"/>
-      <w:r>
-        <w:t xml:space="preserve"> absztrakt osztályban létre kell hozni a(z) „</w:t>
-      </w:r>
-      <w:proofErr w:type="spellStart"/>
-      <w:r>
-        <w:t>id</w:t>
-      </w:r>
-      <w:proofErr w:type="spellEnd"/>
-      <w:r>
-        <w:t>”</w:t>
+        <w:t>A Book absztrakt osztályban létre kell hozni a(z) „id”</w:t>
       </w:r>
       <w:r>
         <w:t>,</w:t>
       </w:r>
       <w:r>
-        <w:t xml:space="preserve"> „</w:t>
-      </w:r>
-      <w:proofErr w:type="spellStart"/>
-      <w:r>
-        <w:t>title</w:t>
-      </w:r>
-      <w:proofErr w:type="spellEnd"/>
-      <w:r>
-        <w:t>”, „</w:t>
-      </w:r>
-      <w:proofErr w:type="spellStart"/>
-      <w:r>
-        <w:t>author</w:t>
-      </w:r>
-      <w:proofErr w:type="spellEnd"/>
-      <w:r>
-        <w:t>” változókat, és a hozzájuk tartozó konstruktort</w:t>
+        <w:t xml:space="preserve"> „title”, „author”</w:t>
+      </w:r>
+      <w:r>
+        <w:t xml:space="preserve"> és „loanDuration”</w:t>
+      </w:r>
+      <w:r>
+        <w:t xml:space="preserve"> változókat, és a hozzájuk tartozó konstruktort</w:t>
       </w:r>
       <w:r>
         <w:t>.</w:t>
@@ -1354,14 +1203,12 @@
         </w:rPr>
         <w:t>„</w:t>
       </w:r>
-      <w:proofErr w:type="spellStart"/>
       <w:r>
         <w:rPr>
           <w:sz w:val="24"/>
         </w:rPr>
         <w:t>private</w:t>
       </w:r>
-      <w:proofErr w:type="spellEnd"/>
       <w:r>
         <w:rPr>
           <w:sz w:val="24"/>
@@ -1372,35 +1219,7 @@
         <w:rPr>
           <w:sz w:val="24"/>
         </w:rPr>
-        <w:t xml:space="preserve"> </w:t>
-      </w:r>
-      <w:proofErr w:type="spellStart"/>
-      <w:r>
-        <w:rPr>
-          <w:sz w:val="24"/>
-        </w:rPr>
-        <w:t>access</w:t>
-      </w:r>
-      <w:proofErr w:type="spellEnd"/>
-      <w:r>
-        <w:rPr>
-          <w:sz w:val="24"/>
-        </w:rPr>
-        <w:t xml:space="preserve"> </w:t>
-      </w:r>
-      <w:proofErr w:type="spellStart"/>
-      <w:r>
-        <w:rPr>
-          <w:sz w:val="24"/>
-        </w:rPr>
-        <w:t>modifierrel</w:t>
-      </w:r>
-      <w:proofErr w:type="spellEnd"/>
-      <w:r>
-        <w:rPr>
-          <w:sz w:val="24"/>
-        </w:rPr>
-        <w:t xml:space="preserve"> rendelkeznek</w:t>
+        <w:t xml:space="preserve"> access modifierrel rendelkeznek</w:t>
       </w:r>
       <w:r>
         <w:rPr>
@@ -1438,41 +1257,13 @@
         <w:rPr>
           <w:sz w:val="24"/>
         </w:rPr>
-        <w:t xml:space="preserve">Sima </w:t>
-      </w:r>
-      <w:proofErr w:type="spellStart"/>
-      <w:r>
-        <w:rPr>
-          <w:sz w:val="24"/>
-        </w:rPr>
-        <w:t>Getter</w:t>
-      </w:r>
-      <w:proofErr w:type="spellEnd"/>
-      <w:r>
-        <w:rPr>
-          <w:sz w:val="24"/>
-        </w:rPr>
-        <w:t xml:space="preserve"> metódust kell definiálni</w:t>
-      </w:r>
-      <w:r>
-        <w:rPr>
-          <w:sz w:val="24"/>
-        </w:rPr>
-        <w:t xml:space="preserve"> minden </w:t>
-      </w:r>
-      <w:proofErr w:type="spellStart"/>
-      <w:r>
-        <w:rPr>
-          <w:sz w:val="24"/>
-        </w:rPr>
-        <w:t>Bookból</w:t>
-      </w:r>
-      <w:proofErr w:type="spellEnd"/>
-      <w:r>
-        <w:rPr>
-          <w:sz w:val="24"/>
-        </w:rPr>
-        <w:t xml:space="preserve"> származott osztályban</w:t>
+        <w:t>Sima Getter metódust kell definiálni</w:t>
+      </w:r>
+      <w:r>
+        <w:rPr>
+          <w:sz w:val="24"/>
+        </w:rPr>
+        <w:t xml:space="preserve"> minden Bookból származott osztályban</w:t>
       </w:r>
       <w:r>
         <w:rPr>
@@ -1492,19 +1283,11 @@
           <w:sz w:val="24"/>
         </w:rPr>
       </w:pPr>
-      <w:proofErr w:type="spellStart"/>
-      <w:r>
-        <w:rPr>
-          <w:sz w:val="24"/>
-        </w:rPr>
-        <w:t>id</w:t>
-      </w:r>
-      <w:proofErr w:type="spellEnd"/>
-      <w:r>
-        <w:rPr>
-          <w:sz w:val="24"/>
-        </w:rPr>
-        <w:t>,</w:t>
+      <w:r>
+        <w:rPr>
+          <w:sz w:val="24"/>
+        </w:rPr>
+        <w:t>id,</w:t>
       </w:r>
     </w:p>
     <w:p>
@@ -1518,19 +1301,11 @@
           <w:sz w:val="24"/>
         </w:rPr>
       </w:pPr>
-      <w:proofErr w:type="spellStart"/>
-      <w:r>
-        <w:rPr>
-          <w:sz w:val="24"/>
-        </w:rPr>
-        <w:t>title</w:t>
-      </w:r>
-      <w:proofErr w:type="spellEnd"/>
-      <w:r>
-        <w:rPr>
-          <w:sz w:val="24"/>
-        </w:rPr>
-        <w:t>,</w:t>
+      <w:r>
+        <w:rPr>
+          <w:sz w:val="24"/>
+        </w:rPr>
+        <w:t>title,</w:t>
       </w:r>
     </w:p>
     <w:p>
@@ -1544,19 +1319,11 @@
           <w:sz w:val="24"/>
         </w:rPr>
       </w:pPr>
-      <w:proofErr w:type="spellStart"/>
-      <w:r>
-        <w:rPr>
-          <w:sz w:val="24"/>
-        </w:rPr>
-        <w:t>author</w:t>
-      </w:r>
-      <w:proofErr w:type="spellEnd"/>
-      <w:r>
-        <w:rPr>
-          <w:sz w:val="24"/>
-        </w:rPr>
-        <w:t>,</w:t>
+      <w:r>
+        <w:rPr>
+          <w:sz w:val="24"/>
+        </w:rPr>
+        <w:t>author,</w:t>
       </w:r>
     </w:p>
     <w:p>
@@ -1570,19 +1337,11 @@
           <w:sz w:val="24"/>
         </w:rPr>
       </w:pPr>
-      <w:proofErr w:type="spellStart"/>
-      <w:r>
-        <w:rPr>
-          <w:sz w:val="24"/>
-        </w:rPr>
-        <w:t>loanDuration</w:t>
-      </w:r>
-      <w:proofErr w:type="spellEnd"/>
-      <w:r>
-        <w:rPr>
-          <w:sz w:val="24"/>
-        </w:rPr>
-        <w:t xml:space="preserve"> </w:t>
+      <w:r>
+        <w:rPr>
+          <w:sz w:val="24"/>
+        </w:rPr>
+        <w:t xml:space="preserve">loanDuration </w:t>
       </w:r>
       <w:r>
         <w:rPr>
@@ -1601,98 +1360,26 @@
         <w:rPr>
           <w:sz w:val="24"/>
         </w:rPr>
-        <w:t xml:space="preserve">Sima </w:t>
-      </w:r>
-      <w:proofErr w:type="spellStart"/>
-      <w:r>
-        <w:rPr>
-          <w:sz w:val="24"/>
-        </w:rPr>
-        <w:t>Setter</w:t>
-      </w:r>
-      <w:proofErr w:type="spellEnd"/>
-      <w:r>
-        <w:rPr>
-          <w:sz w:val="24"/>
-        </w:rPr>
-        <w:t xml:space="preserve"> </w:t>
-      </w:r>
-      <w:proofErr w:type="spellStart"/>
-      <w:r>
-        <w:rPr>
-          <w:sz w:val="24"/>
-        </w:rPr>
-        <w:t>metóust</w:t>
-      </w:r>
-      <w:proofErr w:type="spellEnd"/>
-      <w:r>
-        <w:rPr>
-          <w:sz w:val="24"/>
-        </w:rPr>
-        <w:t xml:space="preserve"> </w:t>
-      </w:r>
-      <w:r>
-        <w:rPr>
-          <w:sz w:val="24"/>
-        </w:rPr>
-        <w:t xml:space="preserve">nem kell definiálni </w:t>
-      </w:r>
-      <w:proofErr w:type="spellStart"/>
-      <w:r>
-        <w:rPr>
-          <w:sz w:val="24"/>
-        </w:rPr>
-        <w:t>Bookból</w:t>
-      </w:r>
-      <w:proofErr w:type="spellEnd"/>
-      <w:r>
-        <w:rPr>
-          <w:sz w:val="24"/>
-        </w:rPr>
-        <w:t xml:space="preserve"> származott osztályban sem.</w:t>
-      </w:r>
-    </w:p>
-    <w:p>
-      <w:pPr>
-        <w:rPr>
-          <w:sz w:val="24"/>
-        </w:rPr>
-      </w:pPr>
-      <w:proofErr w:type="spellStart"/>
-      <w:proofErr w:type="gramStart"/>
-      <w:r>
-        <w:rPr>
-          <w:sz w:val="24"/>
-        </w:rPr>
-        <w:t>toString</w:t>
-      </w:r>
-      <w:proofErr w:type="spellEnd"/>
-      <w:r>
-        <w:rPr>
-          <w:sz w:val="24"/>
-        </w:rPr>
-        <w:t>(</w:t>
-      </w:r>
-      <w:proofErr w:type="gramEnd"/>
-      <w:r>
-        <w:rPr>
-          <w:sz w:val="24"/>
-        </w:rPr>
-        <w:t xml:space="preserve">) metódust kell definiálni minden </w:t>
-      </w:r>
-      <w:proofErr w:type="spellStart"/>
-      <w:r>
-        <w:rPr>
-          <w:sz w:val="24"/>
-        </w:rPr>
-        <w:t>Book</w:t>
-      </w:r>
-      <w:proofErr w:type="spellEnd"/>
-      <w:r>
-        <w:rPr>
-          <w:sz w:val="24"/>
-        </w:rPr>
-        <w:t xml:space="preserve"> </w:t>
+        <w:t xml:space="preserve">Sima Setter metóust </w:t>
+      </w:r>
+      <w:r>
+        <w:rPr>
+          <w:sz w:val="24"/>
+        </w:rPr>
+        <w:t>nem kell definiálni Bookból származott osztályban sem.</w:t>
+      </w:r>
+    </w:p>
+    <w:p>
+      <w:pPr>
+        <w:rPr>
+          <w:sz w:val="24"/>
+        </w:rPr>
+      </w:pPr>
+      <w:r>
+        <w:rPr>
+          <w:sz w:val="24"/>
+        </w:rPr>
+        <w:t xml:space="preserve">toString() metódust kell definiálni minden Book </w:t>
       </w:r>
     </w:p>
     <w:p>
@@ -1804,21 +1491,7 @@
         <w:rPr>
           <w:sz w:val="24"/>
         </w:rPr>
-        <w:t xml:space="preserve">2 funkció </w:t>
-      </w:r>
-      <w:proofErr w:type="spellStart"/>
-      <w:r>
-        <w:rPr>
-          <w:sz w:val="24"/>
-        </w:rPr>
-        <w:t>brainstorm</w:t>
-      </w:r>
-      <w:proofErr w:type="spellEnd"/>
-      <w:r>
-        <w:rPr>
-          <w:sz w:val="24"/>
-        </w:rPr>
-        <w:t>:</w:t>
+        <w:t>2 funkció brainstorm:</w:t>
       </w:r>
     </w:p>
     <w:p>
@@ -1862,19 +1535,11 @@
           <w:sz w:val="24"/>
         </w:rPr>
       </w:pPr>
-      <w:proofErr w:type="spellStart"/>
-      <w:r>
-        <w:rPr>
-          <w:sz w:val="24"/>
-        </w:rPr>
-        <w:t>Wordle</w:t>
-      </w:r>
-      <w:proofErr w:type="spellEnd"/>
-      <w:r>
-        <w:rPr>
-          <w:sz w:val="24"/>
-        </w:rPr>
-        <w:t xml:space="preserve"> játék</w:t>
+      <w:r>
+        <w:rPr>
+          <w:sz w:val="24"/>
+        </w:rPr>
+        <w:t>Wordle játék</w:t>
       </w:r>
       <w:r>
         <w:rPr>
@@ -1935,21 +1600,7 @@
         <w:rPr>
           <w:sz w:val="24"/>
         </w:rPr>
-        <w:t xml:space="preserve">Email küldés funkció API </w:t>
-      </w:r>
-      <w:proofErr w:type="spellStart"/>
-      <w:r>
-        <w:rPr>
-          <w:sz w:val="24"/>
-        </w:rPr>
-        <w:t>Sendgrid</w:t>
-      </w:r>
-      <w:proofErr w:type="spellEnd"/>
-      <w:r>
-        <w:rPr>
-          <w:sz w:val="24"/>
-        </w:rPr>
-        <w:t xml:space="preserve"> API segítségével</w:t>
+        <w:t>Email küldés funkció API Sendgrid API segítségével</w:t>
       </w:r>
     </w:p>
     <w:p>

</xml_diff>